<commit_message>
VP MoPoS V5,6,7,9 done
</commit_message>
<xml_diff>
--- a/2. Semester/MoPoS/MoPoS-P/VP+Skript/5 Trocknung von Dimethylformamid (DMF).docx
+++ b/2. Semester/MoPoS/MoPoS-P/VP+Skript/5 Trocknung von Dimethylformamid (DMF).docx
@@ -10,6 +10,71 @@
           <w:b/>
         </w:rPr>
       </w:pPr>
+      <w:r>
+        <w:rPr>
+          <w:b/>
+          <w:noProof/>
+        </w:rPr>
+        <mc:AlternateContent>
+          <mc:Choice Requires="wpi">
+            <w:drawing>
+              <wp:anchor distT="0" distB="0" distL="114300" distR="114300" simplePos="0" relativeHeight="251659264" behindDoc="0" locked="0" layoutInCell="1" allowOverlap="1" wp14:anchorId="3D2EBB49" wp14:editId="58FF05B2">
+                <wp:simplePos x="0" y="0"/>
+                <wp:positionH relativeFrom="column">
+                  <wp:posOffset>429920</wp:posOffset>
+                </wp:positionH>
+                <wp:positionV relativeFrom="paragraph">
+                  <wp:posOffset>514105</wp:posOffset>
+                </wp:positionV>
+                <wp:extent cx="403560" cy="186480"/>
+                <wp:effectExtent l="38100" t="38100" r="34925" b="42545"/>
+                <wp:wrapNone/>
+                <wp:docPr id="769358888" name="Freihand 1"/>
+                <wp:cNvGraphicFramePr/>
+                <a:graphic xmlns:a="http://schemas.openxmlformats.org/drawingml/2006/main">
+                  <a:graphicData uri="http://schemas.microsoft.com/office/word/2010/wordprocessingInk">
+                    <w14:contentPart bwMode="auto" r:id="rId7">
+                      <w14:nvContentPartPr>
+                        <w14:cNvContentPartPr/>
+                      </w14:nvContentPartPr>
+                      <w14:xfrm>
+                        <a:off x="0" y="0"/>
+                        <a:ext cx="403560" cy="186480"/>
+                      </w14:xfrm>
+                    </w14:contentPart>
+                  </a:graphicData>
+                </a:graphic>
+              </wp:anchor>
+            </w:drawing>
+          </mc:Choice>
+          <mc:Fallback>
+            <w:pict>
+              <v:shapetype w14:anchorId="1EB83BEA" id="_x0000_t75" coordsize="21600,21600" o:spt="75" o:preferrelative="t" path="m@4@5l@4@11@9@11@9@5xe" filled="f" stroked="f">
+                <v:stroke joinstyle="miter"/>
+                <v:formulas>
+                  <v:f eqn="if lineDrawn pixelLineWidth 0"/>
+                  <v:f eqn="sum @0 1 0"/>
+                  <v:f eqn="sum 0 0 @1"/>
+                  <v:f eqn="prod @2 1 2"/>
+                  <v:f eqn="prod @3 21600 pixelWidth"/>
+                  <v:f eqn="prod @3 21600 pixelHeight"/>
+                  <v:f eqn="sum @0 0 1"/>
+                  <v:f eqn="prod @6 1 2"/>
+                  <v:f eqn="prod @7 21600 pixelWidth"/>
+                  <v:f eqn="sum @8 21600 0"/>
+                  <v:f eqn="prod @7 21600 pixelHeight"/>
+                  <v:f eqn="sum @10 21600 0"/>
+                </v:formulas>
+                <v:path o:extrusionok="f" gradientshapeok="t" o:connecttype="rect"/>
+                <o:lock v:ext="edit" aspectratio="t"/>
+              </v:shapetype>
+              <v:shape id="Freihand 1" o:spid="_x0000_s1026" type="#_x0000_t75" style="position:absolute;margin-left:33.5pt;margin-top:40.15pt;width:32.5pt;height:15.4pt;z-index:251659264;visibility:visible;mso-wrap-style:square;mso-wrap-distance-left:9pt;mso-wrap-distance-top:0;mso-wrap-distance-right:9pt;mso-wrap-distance-bottom:0;mso-position-horizontal:absolute;mso-position-horizontal-relative:text;mso-position-vertical:absolute;mso-position-vertical-relative:text" o:gfxdata="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">
+                <v:imagedata r:id="rId8" o:title=""/>
+              </v:shape>
+            </w:pict>
+          </mc:Fallback>
+        </mc:AlternateContent>
+      </w:r>
       <w:r>
         <w:rPr>
           <w:b/>
@@ -950,124 +1015,6 @@
                       <pic:pic xmlns:pic="http://schemas.openxmlformats.org/drawingml/2006/picture">
                         <pic:nvPicPr>
                           <pic:cNvPr id="0" name="Picture 49" descr="GHS 02 (entzündlich)"/>
-                          <pic:cNvPicPr>
-                            <a:picLocks noChangeAspect="1" noChangeArrowheads="1"/>
-                          </pic:cNvPicPr>
-                        </pic:nvPicPr>
-                        <pic:blipFill>
-                          <a:blip r:embed="rId7">
-                            <a:extLst>
-                              <a:ext uri="{28A0092B-C50C-407E-A947-70E740481C1C}">
-                                <a14:useLocalDpi xmlns:a14="http://schemas.microsoft.com/office/drawing/2010/main" val="0"/>
-                              </a:ext>
-                            </a:extLst>
-                          </a:blip>
-                          <a:srcRect/>
-                          <a:stretch>
-                            <a:fillRect/>
-                          </a:stretch>
-                        </pic:blipFill>
-                        <pic:spPr bwMode="auto">
-                          <a:xfrm>
-                            <a:off x="0" y="0"/>
-                            <a:ext cx="342900" cy="342900"/>
-                          </a:xfrm>
-                          <a:prstGeom prst="rect">
-                            <a:avLst/>
-                          </a:prstGeom>
-                          <a:noFill/>
-                          <a:ln>
-                            <a:noFill/>
-                          </a:ln>
-                        </pic:spPr>
-                      </pic:pic>
-                    </a:graphicData>
-                  </a:graphic>
-                </wp:inline>
-              </w:drawing>
-            </w:r>
-            <w:r>
-              <w:rPr>
-                <w:noProof/>
-              </w:rPr>
-              <w:t> </w:t>
-            </w:r>
-            <w:r>
-              <w:rPr>
-                <w:noProof/>
-              </w:rPr>
-              <w:drawing>
-                <wp:inline distT="0" distB="0" distL="0" distR="0" wp14:anchorId="03344AD4" wp14:editId="0827595F">
-                  <wp:extent cx="342900" cy="342900"/>
-                  <wp:effectExtent l="0" t="0" r="0" b="0"/>
-                  <wp:docPr id="1355363630" name="Grafik 14" descr="GHS 07 (reizend)"/>
-                  <wp:cNvGraphicFramePr>
-                    <a:graphicFrameLocks xmlns:a="http://schemas.openxmlformats.org/drawingml/2006/main" noChangeAspect="1"/>
-                  </wp:cNvGraphicFramePr>
-                  <a:graphic xmlns:a="http://schemas.openxmlformats.org/drawingml/2006/main">
-                    <a:graphicData uri="http://schemas.openxmlformats.org/drawingml/2006/picture">
-                      <pic:pic xmlns:pic="http://schemas.openxmlformats.org/drawingml/2006/picture">
-                        <pic:nvPicPr>
-                          <pic:cNvPr id="0" name="Picture 50" descr="GHS 07 (reizend)"/>
-                          <pic:cNvPicPr>
-                            <a:picLocks noChangeAspect="1" noChangeArrowheads="1"/>
-                          </pic:cNvPicPr>
-                        </pic:nvPicPr>
-                        <pic:blipFill>
-                          <a:blip r:embed="rId8">
-                            <a:extLst>
-                              <a:ext uri="{28A0092B-C50C-407E-A947-70E740481C1C}">
-                                <a14:useLocalDpi xmlns:a14="http://schemas.microsoft.com/office/drawing/2010/main" val="0"/>
-                              </a:ext>
-                            </a:extLst>
-                          </a:blip>
-                          <a:srcRect/>
-                          <a:stretch>
-                            <a:fillRect/>
-                          </a:stretch>
-                        </pic:blipFill>
-                        <pic:spPr bwMode="auto">
-                          <a:xfrm>
-                            <a:off x="0" y="0"/>
-                            <a:ext cx="342900" cy="342900"/>
-                          </a:xfrm>
-                          <a:prstGeom prst="rect">
-                            <a:avLst/>
-                          </a:prstGeom>
-                          <a:noFill/>
-                          <a:ln>
-                            <a:noFill/>
-                          </a:ln>
-                        </pic:spPr>
-                      </pic:pic>
-                    </a:graphicData>
-                  </a:graphic>
-                </wp:inline>
-              </w:drawing>
-            </w:r>
-            <w:r>
-              <w:rPr>
-                <w:noProof/>
-              </w:rPr>
-              <w:t> </w:t>
-            </w:r>
-            <w:r>
-              <w:rPr>
-                <w:noProof/>
-              </w:rPr>
-              <w:drawing>
-                <wp:inline distT="0" distB="0" distL="0" distR="0" wp14:anchorId="689C4763" wp14:editId="4E6B8270">
-                  <wp:extent cx="342900" cy="342900"/>
-                  <wp:effectExtent l="0" t="0" r="0" b="0"/>
-                  <wp:docPr id="1586164229" name="Grafik 13" descr="GHS 08 (gesundheitsschädlich)"/>
-                  <wp:cNvGraphicFramePr>
-                    <a:graphicFrameLocks xmlns:a="http://schemas.openxmlformats.org/drawingml/2006/main" noChangeAspect="1"/>
-                  </wp:cNvGraphicFramePr>
-                  <a:graphic xmlns:a="http://schemas.openxmlformats.org/drawingml/2006/main">
-                    <a:graphicData uri="http://schemas.openxmlformats.org/drawingml/2006/picture">
-                      <pic:pic xmlns:pic="http://schemas.openxmlformats.org/drawingml/2006/picture">
-                        <pic:nvPicPr>
-                          <pic:cNvPr id="0" name="Picture 51" descr="GHS 08 (gesundheitsschädlich)"/>
                           <pic:cNvPicPr>
                             <a:picLocks noChangeAspect="1" noChangeArrowheads="1"/>
                           </pic:cNvPicPr>
@@ -1104,163 +1051,21 @@
                 </wp:inline>
               </w:drawing>
             </w:r>
-          </w:p>
-        </w:tc>
-        <w:tc>
-          <w:tcPr>
-            <w:tcW w:w="1701" w:type="dxa"/>
-            <w:tcBorders>
-              <w:top w:val="single" w:sz="6" w:space="0" w:color="auto"/>
-              <w:left w:val="single" w:sz="6" w:space="0" w:color="auto"/>
-              <w:bottom w:val="single" w:sz="6" w:space="0" w:color="auto"/>
-              <w:right w:val="single" w:sz="6" w:space="0" w:color="auto"/>
-            </w:tcBorders>
-            <w:vAlign w:val="center"/>
-          </w:tcPr>
-          <w:p>
-            <w:pPr>
-              <w:spacing w:line="240" w:lineRule="auto"/>
-              <w:jc w:val="left"/>
-            </w:pPr>
-            <w:r>
-              <w:t>Gefahr</w:t>
-            </w:r>
-          </w:p>
-        </w:tc>
-        <w:tc>
-          <w:tcPr>
-            <w:tcW w:w="1985" w:type="dxa"/>
-            <w:tcBorders>
-              <w:top w:val="single" w:sz="6" w:space="0" w:color="auto"/>
-              <w:left w:val="single" w:sz="6" w:space="0" w:color="auto"/>
-              <w:bottom w:val="single" w:sz="6" w:space="0" w:color="auto"/>
-              <w:right w:val="single" w:sz="6" w:space="0" w:color="auto"/>
-            </w:tcBorders>
-            <w:vAlign w:val="center"/>
-          </w:tcPr>
-          <w:p>
-            <w:pPr>
-              <w:spacing w:line="240" w:lineRule="auto"/>
-              <w:jc w:val="left"/>
-            </w:pPr>
-            <w:r>
-              <w:t>H226</w:t>
-            </w:r>
-            <w:r>
-              <w:t>,</w:t>
-            </w:r>
-            <w:r>
-              <w:t xml:space="preserve"> H312</w:t>
-            </w:r>
-            <w:r>
-              <w:t>,</w:t>
-            </w:r>
-            <w:r>
-              <w:t xml:space="preserve"> H319</w:t>
-            </w:r>
-            <w:r>
-              <w:t>,</w:t>
-            </w:r>
-            <w:r>
-              <w:t xml:space="preserve"> H332</w:t>
-            </w:r>
-            <w:r>
-              <w:t>,</w:t>
-            </w:r>
-            <w:r>
-              <w:t xml:space="preserve"> H360D</w:t>
-            </w:r>
-          </w:p>
-        </w:tc>
-        <w:tc>
-          <w:tcPr>
-            <w:tcW w:w="1959" w:type="dxa"/>
-            <w:tcBorders>
-              <w:top w:val="single" w:sz="6" w:space="0" w:color="auto"/>
-              <w:left w:val="single" w:sz="6" w:space="0" w:color="auto"/>
-              <w:bottom w:val="single" w:sz="6" w:space="0" w:color="auto"/>
-              <w:right w:val="single" w:sz="6" w:space="0" w:color="auto"/>
-            </w:tcBorders>
-            <w:vAlign w:val="center"/>
-          </w:tcPr>
-          <w:p>
-            <w:pPr>
-              <w:spacing w:line="240" w:lineRule="auto"/>
-              <w:jc w:val="left"/>
+            <w:r>
               <w:rPr>
-                <w:lang w:val="en-GB"/>
+                <w:noProof/>
               </w:rPr>
-            </w:pPr>
-            <w:r>
-              <w:t>P201</w:t>
-            </w:r>
-            <w:r>
-              <w:t>,</w:t>
-            </w:r>
-            <w:r>
-              <w:t xml:space="preserve"> P280</w:t>
-            </w:r>
-            <w:r>
-              <w:t>,</w:t>
-            </w:r>
-            <w:r>
-              <w:t xml:space="preserve"> P305+351+338</w:t>
-            </w:r>
-            <w:r>
-              <w:t>,</w:t>
-            </w:r>
-            <w:r>
-              <w:t xml:space="preserve"> P308+313</w:t>
-            </w:r>
-          </w:p>
-        </w:tc>
-      </w:tr>
-      <w:tr>
-        <w:tc>
-          <w:tcPr>
-            <w:tcW w:w="1869" w:type="dxa"/>
-            <w:tcBorders>
-              <w:top w:val="single" w:sz="6" w:space="0" w:color="auto"/>
-              <w:left w:val="single" w:sz="6" w:space="0" w:color="auto"/>
-              <w:bottom w:val="single" w:sz="6" w:space="0" w:color="auto"/>
-              <w:right w:val="single" w:sz="6" w:space="0" w:color="auto"/>
-            </w:tcBorders>
-          </w:tcPr>
-          <w:p>
-            <w:pPr>
-              <w:spacing w:line="240" w:lineRule="auto"/>
-              <w:jc w:val="left"/>
-            </w:pPr>
-            <w:r>
-              <w:t>Calciumhydrid</w:t>
-            </w:r>
-          </w:p>
-        </w:tc>
-        <w:tc>
-          <w:tcPr>
-            <w:tcW w:w="2126" w:type="dxa"/>
-            <w:tcBorders>
-              <w:top w:val="single" w:sz="6" w:space="0" w:color="auto"/>
-              <w:left w:val="single" w:sz="6" w:space="0" w:color="auto"/>
-              <w:bottom w:val="single" w:sz="6" w:space="0" w:color="auto"/>
-              <w:right w:val="single" w:sz="6" w:space="0" w:color="auto"/>
-            </w:tcBorders>
-            <w:vAlign w:val="center"/>
-          </w:tcPr>
-          <w:p>
-            <w:pPr>
-              <w:spacing w:line="240" w:lineRule="auto"/>
-              <w:jc w:val="left"/>
-            </w:pPr>
+              <w:t> </w:t>
+            </w:r>
             <w:r>
               <w:rPr>
                 <w:noProof/>
               </w:rPr>
               <w:drawing>
-                <wp:inline distT="0" distB="0" distL="0" distR="0" wp14:anchorId="3182B42C" wp14:editId="7E46DAEA">
+                <wp:inline distT="0" distB="0" distL="0" distR="0" wp14:anchorId="03344AD4" wp14:editId="0827595F">
                   <wp:extent cx="342900" cy="342900"/>
                   <wp:effectExtent l="0" t="0" r="0" b="0"/>
-                  <wp:docPr id="349839782" name="Grafik 15" descr="GHS 02 (entzündlich)"/>
+                  <wp:docPr id="1355363630" name="Grafik 14" descr="GHS 07 (reizend)"/>
                   <wp:cNvGraphicFramePr>
                     <a:graphicFrameLocks xmlns:a="http://schemas.openxmlformats.org/drawingml/2006/main" noChangeAspect="1"/>
                   </wp:cNvGraphicFramePr>
@@ -1268,13 +1073,13 @@
                     <a:graphicData uri="http://schemas.openxmlformats.org/drawingml/2006/picture">
                       <pic:pic xmlns:pic="http://schemas.openxmlformats.org/drawingml/2006/picture">
                         <pic:nvPicPr>
-                          <pic:cNvPr id="0" name="Picture 49" descr="GHS 02 (entzündlich)"/>
+                          <pic:cNvPr id="0" name="Picture 50" descr="GHS 07 (reizend)"/>
                           <pic:cNvPicPr>
                             <a:picLocks noChangeAspect="1" noChangeArrowheads="1"/>
                           </pic:cNvPicPr>
                         </pic:nvPicPr>
                         <pic:blipFill>
-                          <a:blip r:embed="rId7">
+                          <a:blip r:embed="rId10">
                             <a:extLst>
                               <a:ext uri="{28A0092B-C50C-407E-A947-70E740481C1C}">
                                 <a14:useLocalDpi xmlns:a14="http://schemas.microsoft.com/office/drawing/2010/main" val="0"/>
@@ -1305,6 +1110,266 @@
                 </wp:inline>
               </w:drawing>
             </w:r>
+            <w:r>
+              <w:rPr>
+                <w:noProof/>
+              </w:rPr>
+              <w:t> </w:t>
+            </w:r>
+            <w:r>
+              <w:rPr>
+                <w:noProof/>
+              </w:rPr>
+              <w:drawing>
+                <wp:inline distT="0" distB="0" distL="0" distR="0" wp14:anchorId="689C4763" wp14:editId="4E6B8270">
+                  <wp:extent cx="342900" cy="342900"/>
+                  <wp:effectExtent l="0" t="0" r="0" b="0"/>
+                  <wp:docPr id="1586164229" name="Grafik 13" descr="GHS 08 (gesundheitsschädlich)"/>
+                  <wp:cNvGraphicFramePr>
+                    <a:graphicFrameLocks xmlns:a="http://schemas.openxmlformats.org/drawingml/2006/main" noChangeAspect="1"/>
+                  </wp:cNvGraphicFramePr>
+                  <a:graphic xmlns:a="http://schemas.openxmlformats.org/drawingml/2006/main">
+                    <a:graphicData uri="http://schemas.openxmlformats.org/drawingml/2006/picture">
+                      <pic:pic xmlns:pic="http://schemas.openxmlformats.org/drawingml/2006/picture">
+                        <pic:nvPicPr>
+                          <pic:cNvPr id="0" name="Picture 51" descr="GHS 08 (gesundheitsschädlich)"/>
+                          <pic:cNvPicPr>
+                            <a:picLocks noChangeAspect="1" noChangeArrowheads="1"/>
+                          </pic:cNvPicPr>
+                        </pic:nvPicPr>
+                        <pic:blipFill>
+                          <a:blip r:embed="rId11">
+                            <a:extLst>
+                              <a:ext uri="{28A0092B-C50C-407E-A947-70E740481C1C}">
+                                <a14:useLocalDpi xmlns:a14="http://schemas.microsoft.com/office/drawing/2010/main" val="0"/>
+                              </a:ext>
+                            </a:extLst>
+                          </a:blip>
+                          <a:srcRect/>
+                          <a:stretch>
+                            <a:fillRect/>
+                          </a:stretch>
+                        </pic:blipFill>
+                        <pic:spPr bwMode="auto">
+                          <a:xfrm>
+                            <a:off x="0" y="0"/>
+                            <a:ext cx="342900" cy="342900"/>
+                          </a:xfrm>
+                          <a:prstGeom prst="rect">
+                            <a:avLst/>
+                          </a:prstGeom>
+                          <a:noFill/>
+                          <a:ln>
+                            <a:noFill/>
+                          </a:ln>
+                        </pic:spPr>
+                      </pic:pic>
+                    </a:graphicData>
+                  </a:graphic>
+                </wp:inline>
+              </w:drawing>
+            </w:r>
+          </w:p>
+        </w:tc>
+        <w:tc>
+          <w:tcPr>
+            <w:tcW w:w="1701" w:type="dxa"/>
+            <w:tcBorders>
+              <w:top w:val="single" w:sz="6" w:space="0" w:color="auto"/>
+              <w:left w:val="single" w:sz="6" w:space="0" w:color="auto"/>
+              <w:bottom w:val="single" w:sz="6" w:space="0" w:color="auto"/>
+              <w:right w:val="single" w:sz="6" w:space="0" w:color="auto"/>
+            </w:tcBorders>
+            <w:vAlign w:val="center"/>
+          </w:tcPr>
+          <w:p>
+            <w:pPr>
+              <w:spacing w:line="240" w:lineRule="auto"/>
+              <w:jc w:val="left"/>
+            </w:pPr>
+            <w:r>
+              <w:t>Gefahr</w:t>
+            </w:r>
+          </w:p>
+        </w:tc>
+        <w:tc>
+          <w:tcPr>
+            <w:tcW w:w="1985" w:type="dxa"/>
+            <w:tcBorders>
+              <w:top w:val="single" w:sz="6" w:space="0" w:color="auto"/>
+              <w:left w:val="single" w:sz="6" w:space="0" w:color="auto"/>
+              <w:bottom w:val="single" w:sz="6" w:space="0" w:color="auto"/>
+              <w:right w:val="single" w:sz="6" w:space="0" w:color="auto"/>
+            </w:tcBorders>
+            <w:vAlign w:val="center"/>
+          </w:tcPr>
+          <w:p>
+            <w:pPr>
+              <w:spacing w:line="240" w:lineRule="auto"/>
+              <w:jc w:val="left"/>
+            </w:pPr>
+            <w:r>
+              <w:t>H226</w:t>
+            </w:r>
+            <w:r>
+              <w:t>,</w:t>
+            </w:r>
+            <w:r>
+              <w:t xml:space="preserve"> H312</w:t>
+            </w:r>
+            <w:r>
+              <w:t>,</w:t>
+            </w:r>
+            <w:r>
+              <w:t xml:space="preserve"> H319</w:t>
+            </w:r>
+            <w:r>
+              <w:t>,</w:t>
+            </w:r>
+            <w:r>
+              <w:t xml:space="preserve"> H332</w:t>
+            </w:r>
+            <w:r>
+              <w:t>,</w:t>
+            </w:r>
+            <w:r>
+              <w:t xml:space="preserve"> H360D</w:t>
+            </w:r>
+          </w:p>
+        </w:tc>
+        <w:tc>
+          <w:tcPr>
+            <w:tcW w:w="1959" w:type="dxa"/>
+            <w:tcBorders>
+              <w:top w:val="single" w:sz="6" w:space="0" w:color="auto"/>
+              <w:left w:val="single" w:sz="6" w:space="0" w:color="auto"/>
+              <w:bottom w:val="single" w:sz="6" w:space="0" w:color="auto"/>
+              <w:right w:val="single" w:sz="6" w:space="0" w:color="auto"/>
+            </w:tcBorders>
+            <w:vAlign w:val="center"/>
+          </w:tcPr>
+          <w:p>
+            <w:pPr>
+              <w:spacing w:line="240" w:lineRule="auto"/>
+              <w:jc w:val="left"/>
+              <w:rPr>
+                <w:lang w:val="en-GB"/>
+              </w:rPr>
+            </w:pPr>
+            <w:r>
+              <w:t>P201</w:t>
+            </w:r>
+            <w:r>
+              <w:t>,</w:t>
+            </w:r>
+            <w:r>
+              <w:t xml:space="preserve"> P280</w:t>
+            </w:r>
+            <w:r>
+              <w:t>,</w:t>
+            </w:r>
+            <w:r>
+              <w:t xml:space="preserve"> P305+351+338</w:t>
+            </w:r>
+            <w:r>
+              <w:t>,</w:t>
+            </w:r>
+            <w:r>
+              <w:t xml:space="preserve"> P308+313</w:t>
+            </w:r>
+          </w:p>
+        </w:tc>
+      </w:tr>
+      <w:tr>
+        <w:tc>
+          <w:tcPr>
+            <w:tcW w:w="1869" w:type="dxa"/>
+            <w:tcBorders>
+              <w:top w:val="single" w:sz="6" w:space="0" w:color="auto"/>
+              <w:left w:val="single" w:sz="6" w:space="0" w:color="auto"/>
+              <w:bottom w:val="single" w:sz="6" w:space="0" w:color="auto"/>
+              <w:right w:val="single" w:sz="6" w:space="0" w:color="auto"/>
+            </w:tcBorders>
+          </w:tcPr>
+          <w:p>
+            <w:pPr>
+              <w:spacing w:line="240" w:lineRule="auto"/>
+              <w:jc w:val="left"/>
+            </w:pPr>
+            <w:r>
+              <w:t>Calciumhydrid</w:t>
+            </w:r>
+          </w:p>
+        </w:tc>
+        <w:tc>
+          <w:tcPr>
+            <w:tcW w:w="2126" w:type="dxa"/>
+            <w:tcBorders>
+              <w:top w:val="single" w:sz="6" w:space="0" w:color="auto"/>
+              <w:left w:val="single" w:sz="6" w:space="0" w:color="auto"/>
+              <w:bottom w:val="single" w:sz="6" w:space="0" w:color="auto"/>
+              <w:right w:val="single" w:sz="6" w:space="0" w:color="auto"/>
+            </w:tcBorders>
+            <w:vAlign w:val="center"/>
+          </w:tcPr>
+          <w:p>
+            <w:pPr>
+              <w:spacing w:line="240" w:lineRule="auto"/>
+              <w:jc w:val="left"/>
+            </w:pPr>
+            <w:r>
+              <w:rPr>
+                <w:noProof/>
+              </w:rPr>
+              <w:drawing>
+                <wp:inline distT="0" distB="0" distL="0" distR="0" wp14:anchorId="3182B42C" wp14:editId="7E46DAEA">
+                  <wp:extent cx="342900" cy="342900"/>
+                  <wp:effectExtent l="0" t="0" r="0" b="0"/>
+                  <wp:docPr id="349839782" name="Grafik 15" descr="GHS 02 (entzündlich)"/>
+                  <wp:cNvGraphicFramePr>
+                    <a:graphicFrameLocks xmlns:a="http://schemas.openxmlformats.org/drawingml/2006/main" noChangeAspect="1"/>
+                  </wp:cNvGraphicFramePr>
+                  <a:graphic xmlns:a="http://schemas.openxmlformats.org/drawingml/2006/main">
+                    <a:graphicData uri="http://schemas.openxmlformats.org/drawingml/2006/picture">
+                      <pic:pic xmlns:pic="http://schemas.openxmlformats.org/drawingml/2006/picture">
+                        <pic:nvPicPr>
+                          <pic:cNvPr id="0" name="Picture 49" descr="GHS 02 (entzündlich)"/>
+                          <pic:cNvPicPr>
+                            <a:picLocks noChangeAspect="1" noChangeArrowheads="1"/>
+                          </pic:cNvPicPr>
+                        </pic:nvPicPr>
+                        <pic:blipFill>
+                          <a:blip r:embed="rId9">
+                            <a:extLst>
+                              <a:ext uri="{28A0092B-C50C-407E-A947-70E740481C1C}">
+                                <a14:useLocalDpi xmlns:a14="http://schemas.microsoft.com/office/drawing/2010/main" val="0"/>
+                              </a:ext>
+                            </a:extLst>
+                          </a:blip>
+                          <a:srcRect/>
+                          <a:stretch>
+                            <a:fillRect/>
+                          </a:stretch>
+                        </pic:blipFill>
+                        <pic:spPr bwMode="auto">
+                          <a:xfrm>
+                            <a:off x="0" y="0"/>
+                            <a:ext cx="342900" cy="342900"/>
+                          </a:xfrm>
+                          <a:prstGeom prst="rect">
+                            <a:avLst/>
+                          </a:prstGeom>
+                          <a:noFill/>
+                          <a:ln>
+                            <a:noFill/>
+                          </a:ln>
+                        </pic:spPr>
+                      </pic:pic>
+                    </a:graphicData>
+                  </a:graphic>
+                </wp:inline>
+              </w:drawing>
+            </w:r>
           </w:p>
         </w:tc>
         <w:tc>
@@ -2713,6 +2778,100 @@
               <w:rPr>
                 <w:b/>
                 <w:bCs/>
+                <w:noProof/>
+              </w:rPr>
+              <mc:AlternateContent>
+                <mc:Choice Requires="wpi">
+                  <w:drawing>
+                    <wp:anchor distT="0" distB="0" distL="114300" distR="114300" simplePos="0" relativeHeight="251673600" behindDoc="0" locked="0" layoutInCell="1" allowOverlap="1" wp14:anchorId="3D17288F" wp14:editId="7BB405B7">
+                      <wp:simplePos x="0" y="0"/>
+                      <wp:positionH relativeFrom="column">
+                        <wp:posOffset>3648075</wp:posOffset>
+                      </wp:positionH>
+                      <wp:positionV relativeFrom="paragraph">
+                        <wp:posOffset>-92710</wp:posOffset>
+                      </wp:positionV>
+                      <wp:extent cx="1234505" cy="248040"/>
+                      <wp:effectExtent l="38100" t="38100" r="41910" b="38100"/>
+                      <wp:wrapNone/>
+                      <wp:docPr id="1817402968" name="Freihand 15"/>
+                      <wp:cNvGraphicFramePr/>
+                      <a:graphic xmlns:a="http://schemas.openxmlformats.org/drawingml/2006/main">
+                        <a:graphicData uri="http://schemas.microsoft.com/office/word/2010/wordprocessingInk">
+                          <w14:contentPart bwMode="auto" r:id="rId12">
+                            <w14:nvContentPartPr>
+                              <w14:cNvContentPartPr/>
+                            </w14:nvContentPartPr>
+                            <w14:xfrm>
+                              <a:off x="0" y="0"/>
+                              <a:ext cx="1234505" cy="248040"/>
+                            </w14:xfrm>
+                          </w14:contentPart>
+                        </a:graphicData>
+                      </a:graphic>
+                    </wp:anchor>
+                  </w:drawing>
+                </mc:Choice>
+                <mc:Fallback>
+                  <w:pict>
+                    <v:shape w14:anchorId="4FC9656A" id="Freihand 15" o:spid="_x0000_s1026" type="#_x0000_t75" style="position:absolute;margin-left:286.9pt;margin-top:-7.65pt;width:97.9pt;height:20.25pt;z-index:251673600;visibility:visible;mso-wrap-style:square;mso-wrap-distance-left:9pt;mso-wrap-distance-top:0;mso-wrap-distance-right:9pt;mso-wrap-distance-bottom:0;mso-position-horizontal:absolute;mso-position-horizontal-relative:text;mso-position-vertical:absolute;mso-position-vertical-relative:text" o:gfxdata="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">
+                      <v:imagedata r:id="rId13" o:title=""/>
+                    </v:shape>
+                  </w:pict>
+                </mc:Fallback>
+              </mc:AlternateContent>
+            </w:r>
+            <w:r>
+              <w:rPr>
+                <w:b/>
+                <w:bCs/>
+                <w:noProof/>
+              </w:rPr>
+              <mc:AlternateContent>
+                <mc:Choice Requires="wpi">
+                  <w:drawing>
+                    <wp:anchor distT="0" distB="0" distL="114300" distR="114300" simplePos="0" relativeHeight="251674624" behindDoc="0" locked="0" layoutInCell="1" allowOverlap="1" wp14:anchorId="57CAC307" wp14:editId="444C26D4">
+                      <wp:simplePos x="0" y="0"/>
+                      <wp:positionH relativeFrom="column">
+                        <wp:posOffset>548640</wp:posOffset>
+                      </wp:positionH>
+                      <wp:positionV relativeFrom="paragraph">
+                        <wp:posOffset>-6985</wp:posOffset>
+                      </wp:positionV>
+                      <wp:extent cx="985930" cy="125730"/>
+                      <wp:effectExtent l="38100" t="38100" r="24130" b="45720"/>
+                      <wp:wrapNone/>
+                      <wp:docPr id="1086548003" name="Freihand 16"/>
+                      <wp:cNvGraphicFramePr/>
+                      <a:graphic xmlns:a="http://schemas.openxmlformats.org/drawingml/2006/main">
+                        <a:graphicData uri="http://schemas.microsoft.com/office/word/2010/wordprocessingInk">
+                          <w14:contentPart bwMode="auto" r:id="rId14">
+                            <w14:nvContentPartPr>
+                              <w14:cNvContentPartPr/>
+                            </w14:nvContentPartPr>
+                            <w14:xfrm>
+                              <a:off x="0" y="0"/>
+                              <a:ext cx="985930" cy="125730"/>
+                            </w14:xfrm>
+                          </w14:contentPart>
+                        </a:graphicData>
+                      </a:graphic>
+                    </wp:anchor>
+                  </w:drawing>
+                </mc:Choice>
+                <mc:Fallback>
+                  <w:pict>
+                    <v:shape w14:anchorId="6BD7F46B" id="Freihand 16" o:spid="_x0000_s1026" type="#_x0000_t75" style="position:absolute;margin-left:42.85pt;margin-top:-.9pt;width:78.35pt;height:10.6pt;z-index:251674624;visibility:visible;mso-wrap-style:square;mso-wrap-distance-left:9pt;mso-wrap-distance-top:0;mso-wrap-distance-right:9pt;mso-wrap-distance-bottom:0;mso-position-horizontal:absolute;mso-position-horizontal-relative:text;mso-position-vertical:absolute;mso-position-vertical-relative:text" o:gfxdata="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">
+                      <v:imagedata r:id="rId15" o:title=""/>
+                    </v:shape>
+                  </w:pict>
+                </mc:Fallback>
+              </mc:AlternateContent>
+            </w:r>
+            <w:r>
+              <w:rPr>
+                <w:b/>
+                <w:bCs/>
               </w:rPr>
               <w:t>Datum:                                                    Unterschrift Student*in:</w:t>
             </w:r>
@@ -2755,8 +2914,8 @@
       </w:r>
     </w:p>
     <w:sectPr>
-      <w:headerReference w:type="default" r:id="rId10"/>
-      <w:footerReference w:type="default" r:id="rId11"/>
+      <w:headerReference w:type="default" r:id="rId16"/>
+      <w:footerReference w:type="default" r:id="rId17"/>
       <w:pgSz w:w="11906" w:h="16838"/>
       <w:pgMar w:top="2552" w:right="907" w:bottom="851" w:left="1134" w:header="567" w:footer="567" w:gutter="0"/>
       <w:cols w:space="720"/>
@@ -3031,19 +3190,7 @@
       <w:rPr>
         <w:bCs/>
       </w:rPr>
-      <w:t xml:space="preserve">GESTIS-Stoffdatenbank, </w:t>
-    </w:r>
-    <w:r>
-      <w:rPr>
-        <w:bCs/>
-      </w:rPr>
-      <w:t>Sigma-Aldrich</w:t>
-    </w:r>
-    <w:r>
-      <w:rPr>
-        <w:bCs/>
-      </w:rPr>
-      <w:t>-SDS</w:t>
+      <w:t>GESTIS-Stoffdatenbank, Sigma-Aldrich-SDS</w:t>
     </w:r>
   </w:p>
   <w:p/>
@@ -3500,6 +3647,7 @@
   <w:style w:type="character" w:default="1" w:styleId="Absatz-Standardschriftart">
     <w:name w:val="Default Paragraph Font"/>
     <w:uiPriority w:val="1"/>
+    <w:semiHidden/>
     <w:unhideWhenUsed/>
   </w:style>
   <w:style w:type="table" w:default="1" w:styleId="NormaleTabelle">
@@ -3687,6 +3835,110 @@
     <w:rsid w:val="006E0D23"/>
   </w:style>
 </w:styles>
+</file>
+
+<file path=word/ink/ink1.xml><?xml version="1.0" encoding="utf-8"?>
+<inkml:ink xmlns:inkml="http://www.w3.org/2003/InkML">
+  <inkml:definitions>
+    <inkml:context xml:id="ctx0">
+      <inkml:inkSource xml:id="inkSrc0">
+        <inkml:traceFormat>
+          <inkml:channel name="X" type="integer" min="-2.14748E9" max="2.14748E9" units="cm"/>
+          <inkml:channel name="Y" type="integer" min="-2.14748E9" max="2.14748E9" units="cm"/>
+          <inkml:channel name="F" type="integer" max="32767" units="dev"/>
+          <inkml:channel name="OA" type="integer" max="360" units="deg"/>
+          <inkml:channel name="OE" type="integer" max="90" units="deg"/>
+        </inkml:traceFormat>
+        <inkml:channelProperties>
+          <inkml:channelProperty channel="X" name="resolution" value="1000" units="1/cm"/>
+          <inkml:channelProperty channel="Y" name="resolution" value="1000" units="1/cm"/>
+          <inkml:channelProperty channel="F" name="resolution" value="0" units="1/dev"/>
+          <inkml:channelProperty channel="OA" name="resolution" value="1000" units="1/deg"/>
+          <inkml:channelProperty channel="OE" name="resolution" value="1000" units="1/deg"/>
+        </inkml:channelProperties>
+      </inkml:inkSource>
+      <inkml:timestamp xml:id="ts0" timeString="2026-04-22T18:20:04.660"/>
+    </inkml:context>
+    <inkml:brush xml:id="br0">
+      <inkml:brushProperty name="width" value="0.025" units="cm"/>
+      <inkml:brushProperty name="height" value="0.025" units="cm"/>
+    </inkml:brush>
+  </inkml:definitions>
+  <inkml:trace contextRef="#ctx0" brushRef="#br0">0 518 2400 0 0,'0'0'583'0'0,"4"0"-517"0"0,8-2 346 0 0,0 0 1 0 0,0-1-1 0 0,0 0 0 0 0,0-1 0 0 0,21-10 0 0 0,57-35-161 0 0,-83 45-192 0 0,208-133 3647 0 0,-133 83-3372 0 0,-54 37-62 0 0,0 1 0 0 0,55-21 0 0 0,64-12 1483 0 0,-92 32-1151 0 0,0-2 0 0 0,81-40 1 0 0,-54 28 521 0 0,-71 33-654 0 0,-7-1 52 0 0,-8 0 657 0 0</inkml:trace>
+</inkml:ink>
+</file>
+
+<file path=word/ink/ink2.xml><?xml version="1.0" encoding="utf-8"?>
+<inkml:ink xmlns:inkml="http://www.w3.org/2003/InkML">
+  <inkml:definitions>
+    <inkml:context xml:id="ctx0">
+      <inkml:inkSource xml:id="inkSrc0">
+        <inkml:traceFormat>
+          <inkml:channel name="X" type="integer" min="-2.14748E9" max="2.14748E9" units="cm"/>
+          <inkml:channel name="Y" type="integer" min="-2.14748E9" max="2.14748E9" units="cm"/>
+          <inkml:channel name="F" type="integer" max="32767" units="dev"/>
+          <inkml:channel name="OA" type="integer" max="360" units="deg"/>
+          <inkml:channel name="OE" type="integer" max="90" units="deg"/>
+        </inkml:traceFormat>
+        <inkml:channelProperties>
+          <inkml:channelProperty channel="X" name="resolution" value="1000" units="1/cm"/>
+          <inkml:channelProperty channel="Y" name="resolution" value="1000" units="1/cm"/>
+          <inkml:channelProperty channel="F" name="resolution" value="0" units="1/dev"/>
+          <inkml:channelProperty channel="OA" name="resolution" value="1000" units="1/deg"/>
+          <inkml:channelProperty channel="OE" name="resolution" value="1000" units="1/deg"/>
+        </inkml:channelProperties>
+      </inkml:inkSource>
+      <inkml:timestamp xml:id="ts0" timeString="2026-04-22T18:20:18.642"/>
+    </inkml:context>
+    <inkml:brush xml:id="br0">
+      <inkml:brushProperty name="width" value="0.025" units="cm"/>
+      <inkml:brushProperty name="height" value="0.025" units="cm"/>
+    </inkml:brush>
+  </inkml:definitions>
+  <inkml:trace contextRef="#ctx0" brushRef="#br0">428 87 4312 0 0,'-11'2'64'0'0,"0"1"-1"0"0,0 0 1 0 0,0 0 0 0 0,-18 10-1 0 0,23-9-39 0 0,1-1-1 0 0,0 0 0 0 0,0 1 0 0 0,0 0 0 0 0,0 0 0 0 0,0 1 0 0 0,1-1 0 0 0,0 1 0 0 0,0 0 0 0 0,-5 9 0 0 0,-1 0 35 0 0,-1 1-1 0 0,-1-1 1 0 0,0-1 0 0 0,-1 0 0 0 0,-23 17-1 0 0,22-19 26 0 0,0 1-1 0 0,1 0 0 0 0,0 1 1 0 0,1 1-1 0 0,0 0 0 0 0,-9 16 0 0 0,-67 106 1312 0 0,86-134-1346 0 0,0 1 1 0 0,1-1-1 0 0,-1 1 1 0 0,1-1 0 0 0,-1 1-1 0 0,1 0 1 0 0,0-1-1 0 0,0 1 1 0 0,0 0-1 0 0,1 0 1 0 0,-1-1 0 0 0,1 1-1 0 0,-1 5 1 0 0,1-7-24 0 0,0 0-1 0 0,0-1 1 0 0,0 1 0 0 0,1 0 0 0 0,-1 0 0 0 0,0-1 0 0 0,0 1 0 0 0,1 0 0 0 0,-1-1 0 0 0,1 1-1 0 0,-1 0 1 0 0,0-1 0 0 0,1 1 0 0 0,-1-1 0 0 0,1 1 0 0 0,-1-1 0 0 0,1 1 0 0 0,0-1 0 0 0,-1 1 0 0 0,2 0-1 0 0,0 0 0 0 0,-1-1 0 0 0,1 1 0 0 0,0-1 0 0 0,-1 1 0 0 0,1-1 0 0 0,0 0 0 0 0,0 0 0 0 0,0 0 0 0 0,-1 0 0 0 0,1 0 0 0 0,0 0 0 0 0,2 0 0 0 0,17-4 257 0 0,0-1-1 0 0,39-15 0 0 0,-17 5 49 0 0,-17 6-275 0 0,0 0 0 0 0,-1-2 0 0 0,0-1 0 0 0,0-1 0 0 0,-1-1 0 0 0,-1-1 0 0 0,-1-1 0 0 0,29-26 0 0 0,-50 42-47 0 0,-1 0 0 0 0,0 0 0 0 0,1 0 1 0 0,-1-1-1 0 0,1 1 0 0 0,-1 0 0 0 0,0-1 0 0 0,1 1 0 0 0,-1 0 0 0 0,0-1 0 0 0,1 1 0 0 0,-1 0 0 0 0,0-1 0 0 0,0 1 0 0 0,1 0 0 0 0,-1-1 0 0 0,0 1 0 0 0,0-1 0 0 0,0 1 0 0 0,0-1 0 0 0,1 1 0 0 0,-1-1 0 0 0,0 1 1 0 0,0 0-1 0 0,0-1 0 0 0,0 1 0 0 0,0-1 0 0 0,0 1 0 0 0,0-1 0 0 0,0 1 0 0 0,0-1 0 0 0,0 1 0 0 0,-1-1 0 0 0,1 1 0 0 0,0 0 0 0 0,0-1 0 0 0,-1 0 0 0 0,1 1 2 0 0,-1 0 0 0 0,0-1-1 0 0,0 1 1 0 0,1 0 0 0 0,-1 0 0 0 0,0 0-1 0 0,0 0 1 0 0,1 0 0 0 0,-1 0-1 0 0,0 0 1 0 0,0 0 0 0 0,0 0 0 0 0,1 0-1 0 0,-1 1 1 0 0,0-1 0 0 0,0 0 0 0 0,1 0-1 0 0,-1 1 1 0 0,0-1 0 0 0,1 1-1 0 0,-1-1 1 0 0,0 0 0 0 0,0 2 0 0 0,-10 4 37 0 0,1 1 0 0 0,0 0 0 0 0,0 1 0 0 0,0 0 0 0 0,1 1 0 0 0,-13 15 0 0 0,10-9 23 0 0,-1-1-1 0 0,-22 19 0 0 0,-4 4 222 0 0,37-35-268 0 0,0 1 0 0 0,-1-1 0 0 0,1 1 0 0 0,0-1 0 0 0,1 1 0 0 0,-1 0-1 0 0,0 0 1 0 0,1 0 0 0 0,0 0 0 0 0,-1 0 0 0 0,1 0 0 0 0,0 0 0 0 0,1 0 0 0 0,-1 0 0 0 0,0 6 0 0 0,1-7-4 0 0,1 0 1 0 0,-1 0-1 0 0,0-1 1 0 0,1 1-1 0 0,0 0 1 0 0,-1 0-1 0 0,1 0 1 0 0,0 0-1 0 0,0-1 0 0 0,0 1 1 0 0,0 0-1 0 0,0-1 1 0 0,0 1-1 0 0,1-1 1 0 0,-1 1-1 0 0,1-1 1 0 0,-1 0-1 0 0,1 1 1 0 0,-1-1-1 0 0,1 0 1 0 0,-1 0-1 0 0,1 0 1 0 0,0 0-1 0 0,0-1 1 0 0,0 1-1 0 0,-1 0 0 0 0,3 0 1 0 0,8 1 32 0 0,-1 1 0 0 0,0-2-1 0 0,1 1 1 0 0,-1-2 0 0 0,1 0 0 0 0,-1 0 0 0 0,1-1-1 0 0,-1 0 1 0 0,13-3 0 0 0,23-2 156 0 0,166-28 489 0 0,-55 5 26 0 0,-149 28-617 0 0,0 0 0 0 0,0 0 0 0 0,0 1 0 0 0,0 0 0 0 0,13 3 0 0 0,-19-3-29 0 0,0 1 0 0 0,0 0 0 0 0,1 0-1 0 0,-1 0 1 0 0,0 0 0 0 0,-1 1 0 0 0,1-1 0 0 0,0 1 0 0 0,0 0 0 0 0,0 0 0 0 0,-1 0 0 0 0,1 0 0 0 0,-1 0 0 0 0,0 1-1 0 0,0-1 1 0 0,0 1 0 0 0,4 5 0 0 0,-3-3-18 0 0,1 0 1 0 0,-1-1-1 0 0,1 1 0 0 0,1-1 1 0 0,-1 1-1 0 0,1-1 0 0 0,-1-1 1 0 0,1 1-1 0 0,0-1 0 0 0,0 0 0 0 0,1 0 1 0 0,-1 0-1 0 0,1-1 0 0 0,-1 1 1 0 0,1-1-1 0 0,0-1 0 0 0,0 1 1 0 0,0-1-1 0 0,0 0 0 0 0,0-1 0 0 0,0 1 1 0 0,0-1-1 0 0,0 0 0 0 0,0-1 1 0 0,0 1-1 0 0,0-1 0 0 0,0 0 0 0 0,6-3 1 0 0,99-17 570 0 0,-83 17-509 0 0,-17 1-68 0 0,-1 2 0 0 0,1-1 0 0 0,0 1 1 0 0,0 1-1 0 0,0 0 0 0 0,0 1 0 0 0,0 0 0 0 0,0 0 0 0 0,-1 1 0 0 0,1 1 0 0 0,11 3 0 0 0,-16-4-508 0 0</inkml:trace>
+  <inkml:trace contextRef="#ctx0" brushRef="#br0" timeOffset="910.18">1515 646 12056 0 0,'0'0'1697'0'0,"3"-2"-1538"0"0,156-165 1670 0 0,26-39-1353 0 0,-131 129-430 0 0,-38 52-25 0 0,1 1 1 0 0,1 1 0 0 0,34-36 0 0 0,-36 43-13 0 0,-12 11-4 0 0,0 1 0 0 0,0 0 1 0 0,0-1-1 0 0,0 2 1 0 0,1-1-1 0 0,0 0 0 0 0,-1 1 1 0 0,1 0-1 0 0,0 0 1 0 0,1 0-1 0 0,9-3 0 0 0,-15 6 5 0 0,1 0-1 0 0,0 0 1 0 0,-1 1-1 0 0,1-1 0 0 0,-1 0 1 0 0,1 0-1 0 0,-1 0 1 0 0,1 1-1 0 0,0-1 0 0 0,-1 0 1 0 0,1 0-1 0 0,-1 1 0 0 0,1-1 1 0 0,-1 1-1 0 0,1-1 1 0 0,-1 0-1 0 0,0 1 0 0 0,1-1 1 0 0,-1 1-1 0 0,1-1 0 0 0,-1 1 1 0 0,0-1-1 0 0,1 1 1 0 0,-1-1-1 0 0,0 1 0 0 0,0 0 1 0 0,0-1-1 0 0,1 1 0 0 0,-1-1 1 0 0,0 1-1 0 0,0-1 1 0 0,0 1-1 0 0,0 0 0 0 0,0-1 1 0 0,0 1-1 0 0,0 0 1 0 0,0-1-1 0 0,0 1 0 0 0,0-1 1 0 0,-1 2-1 0 0,-3 28 76 0 0,3-29-69 0 0,-7 30 204 0 0,-2-1 0 0 0,-1-1 1 0 0,-21 40-1 0 0,-12 4 151 0 0,31-56-130 0 0,2 2 0 0 0,0 0 1 0 0,-12 29-1 0 0,-33 125 1327 0 0,56-172-1549 0 0,0-1-1 0 0,0 0 1 0 0,0 0-1 0 0,0 0 1 0 0,0 0-1 0 0,0 0 1 0 0,-1 0 0 0 0,1 0-1 0 0,0 0 1 0 0,0 1-1 0 0,0-1 1 0 0,0 0-1 0 0,0 0 1 0 0,-1 0 0 0 0,1 0-1 0 0,0 0 1 0 0,0 0-1 0 0,0 0 1 0 0,0 0-1 0 0,0 0 1 0 0,-1 0-1 0 0,1 0 1 0 0,0 0 0 0 0,0 0-1 0 0,0 0 1 0 0,0 0-1 0 0,0 0 1 0 0,-1 0-1 0 0,1 0 1 0 0,0 0 0 0 0,0 0-1 0 0,0-1 1 0 0,0 1-1 0 0,0 0 1 0 0,-1 0-1 0 0,1 0 1 0 0,0 0 0 0 0,0 0-1 0 0,0 0 1 0 0,0 0-1 0 0,0 0 1 0 0,0-1-1 0 0,0 1 1 0 0,-1 0-1 0 0,-11-10 379 0 0,-18-21-246 0 0,19 19-53 0 0,-2-2-31 0 0,1-1 0 0 0,1 0 0 0 0,0-1-1 0 0,-13-26 1 0 0,-17-26 142 0 0,39 65-199 0 0,-1-1 1 0 0,0 1-1 0 0,0 0 1 0 0,-1 0-1 0 0,1 0 0 0 0,0 1 1 0 0,-1-1-1 0 0,0 1 0 0 0,1 0 1 0 0,-1 0-1 0 0,0 0 1 0 0,0 0-1 0 0,-8-1 0 0 0,11 3-13 0 0,1 1 0 0 0,0-1-1 0 0,-1 1 1 0 0,1-1 0 0 0,0 1-1 0 0,0 0 1 0 0,-1-1-1 0 0,1 1 1 0 0,0-1 0 0 0,0 1-1 0 0,0 0 1 0 0,0-1 0 0 0,0 1-1 0 0,0-1 1 0 0,0 1 0 0 0,0 0-1 0 0,0-1 1 0 0,0 1 0 0 0,0 0-1 0 0,0-1 1 0 0,0 1 0 0 0,1-1-1 0 0,-1 1 1 0 0,0 0-1 0 0,0-1 1 0 0,1 1 0 0 0,-1-1-1 0 0,0 1 1 0 0,1-1 0 0 0,-1 1-1 0 0,0-1 1 0 0,1 1 0 0 0,12 15-42 0 0,0-1 0 0 0,1 0 0 0 0,28 22 0 0 0,-33-31 3 0 0,-1 0 1 0 0,1-1-1 0 0,0 0 1 0 0,0 0-1 0 0,0-1 1 0 0,1 0-1 0 0,0-1 1 0 0,-1 0-1 0 0,18 3 1 0 0,26-1-173 0 0,1-2-1 0 0,55-5 1 0 0,-17 0-46 0 0,33 2 99 0 0,-123 0 161 0 0,0 0 1 0 0,0 0-1 0 0,0 1 1 0 0,0-1-1 0 0,0 0 0 0 0,0 0 1 0 0,0 1-1 0 0,0 0 1 0 0,-1-1-1 0 0,1 1 0 0 0,0 0 1 0 0,2 1-1 0 0,-4-1 3 0 0,1-1 0 0 0,-1 1 0 0 0,0 0 0 0 0,1-1 1 0 0,-1 1-1 0 0,0 0 0 0 0,0-1 0 0 0,0 1 0 0 0,0 0 0 0 0,0 0 0 0 0,1-1 0 0 0,-1 1 0 0 0,0 0 0 0 0,-1 0 0 0 0,1-1 0 0 0,0 1 0 0 0,0 0 1 0 0,0 0-1 0 0,0-1 0 0 0,-1 1 0 0 0,1 0 0 0 0,0 0 0 0 0,0-1 0 0 0,-1 1 0 0 0,1-1 0 0 0,-1 1 0 0 0,1 0 0 0 0,-1-1 0 0 0,1 1 0 0 0,-1-1 1 0 0,1 1-1 0 0,-1 0 0 0 0,-4 5 22 0 0,0-1 1 0 0,0 1-1 0 0,-1-1 1 0 0,-10 7-1 0 0,12-9 11 0 0,-1 1 0 0 0,1-1 0 0 0,0 1 0 0 0,0 0 0 0 0,0 0 0 0 0,0 0 1 0 0,1 1-1 0 0,-1-1 0 0 0,-3 7 0 0 0,7-9-23 0 0,0-1 0 0 0,0 1 0 0 0,-1-1 0 0 0,1 1 0 0 0,0 0 0 0 0,0-1 0 0 0,0 1 0 0 0,0-1 1 0 0,1 1-1 0 0,-1-1 0 0 0,0 1 0 0 0,1-1 0 0 0,-1 1 0 0 0,1-1 0 0 0,-1 0 0 0 0,1 1 0 0 0,0-1 0 0 0,0 0 0 0 0,-1 1 1 0 0,1-1-1 0 0,0 0 0 0 0,0 0 0 0 0,0 0 0 0 0,0 0 0 0 0,1 0 0 0 0,-1 0 0 0 0,0 0 0 0 0,0 0 0 0 0,1 0 0 0 0,1 1 1 0 0,6 3 114 0 0,0 1 0 0 0,19 7 1 0 0,-27-13-127 0 0,30 12 129 0 0,2-2-1 0 0,0-1 1 0 0,0-1 0 0 0,63 6-1 0 0,138-6 405 0 0,-199-7-510 0 0,462-14 543 0 0,-430 6-513 0 0,6-3-6 0 0</inkml:trace>
+</inkml:ink>
+</file>
+
+<file path=word/ink/ink3.xml><?xml version="1.0" encoding="utf-8"?>
+<inkml:ink xmlns:inkml="http://www.w3.org/2003/InkML">
+  <inkml:definitions>
+    <inkml:context xml:id="ctx0">
+      <inkml:inkSource xml:id="inkSrc0">
+        <inkml:traceFormat>
+          <inkml:channel name="X" type="integer" min="-2.14748E9" max="2.14748E9" units="cm"/>
+          <inkml:channel name="Y" type="integer" min="-2.14748E9" max="2.14748E9" units="cm"/>
+          <inkml:channel name="F" type="integer" max="32767" units="dev"/>
+          <inkml:channel name="OA" type="integer" max="360" units="deg"/>
+          <inkml:channel name="OE" type="integer" max="90" units="deg"/>
+        </inkml:traceFormat>
+        <inkml:channelProperties>
+          <inkml:channelProperty channel="X" name="resolution" value="1000" units="1/cm"/>
+          <inkml:channelProperty channel="Y" name="resolution" value="1000" units="1/cm"/>
+          <inkml:channelProperty channel="F" name="resolution" value="0" units="1/dev"/>
+          <inkml:channelProperty channel="OA" name="resolution" value="1000" units="1/deg"/>
+          <inkml:channelProperty channel="OE" name="resolution" value="1000" units="1/deg"/>
+        </inkml:channelProperties>
+      </inkml:inkSource>
+      <inkml:timestamp xml:id="ts0" timeString="2026-04-22T18:20:11.220"/>
+    </inkml:context>
+    <inkml:brush xml:id="br0">
+      <inkml:brushProperty name="width" value="0.025" units="cm"/>
+      <inkml:brushProperty name="height" value="0.025" units="cm"/>
+    </inkml:brush>
+  </inkml:definitions>
+  <inkml:trace contextRef="#ctx0" brushRef="#br0">0 85 2400 0 0,'0'0'128'0'0,"12"-23"135"0"0,-9 18-140 0 0,0 1 1 0 0,0 0-1 0 0,0 0 1 0 0,1 0 0 0 0,0 0-1 0 0,-1 1 1 0 0,1 0-1 0 0,1 0 1 0 0,-1 0 0 0 0,0 0-1 0 0,1 0 1 0 0,-1 1-1 0 0,1 0 1 0 0,10-3 0 0 0,-7 3 21 0 0,0 1 0 0 0,0 0 0 0 0,0 0 0 0 0,0 1 0 0 0,0 0 0 0 0,0 0 0 0 0,0 1 0 0 0,15 3 0 0 0,-17-2 55 0 0,1-1-1 0 0,-1 1 1 0 0,0-1-1 0 0,0 2 0 0 0,0-1 1 0 0,0 1-1 0 0,0 0 1 0 0,-1 0-1 0 0,8 5 0 0 0,-11-6-120 0 0,0 1-1 0 0,0-1 1 0 0,0 0-1 0 0,0 1 1 0 0,0-1-1 0 0,-1 1 1 0 0,1 0-1 0 0,-1-1 1 0 0,0 1-1 0 0,1 0 0 0 0,-1 0 1 0 0,0 0-1 0 0,-1 0 1 0 0,1 0-1 0 0,-1 0 1 0 0,1 0-1 0 0,-1 0 1 0 0,0 0-1 0 0,0 0 0 0 0,0 0 1 0 0,-1 5-1 0 0,0 2-39 0 0,0-1 0 0 0,0 1 0 0 0,-1-1 0 0 0,0 0 0 0 0,-1 0 0 0 0,0 0-1 0 0,-1 0 1 0 0,1 0 0 0 0,-1 0 0 0 0,-1-1 0 0 0,0 0 0 0 0,0 0 0 0 0,-1 0-1 0 0,0-1 1 0 0,0 0 0 0 0,-1 0 0 0 0,1 0 0 0 0,-2-1 0 0 0,-14 11 0 0 0,3-4 502 0 0,-1-1 0 0 0,0 0 1 0 0,-27 10-1 0 0,46-22-497 0 0,0 0 0 0 0,-1 0 0 0 0,1 1 1 0 0,0-1-1 0 0,0 0 0 0 0,-1 0 0 0 0,1 0 0 0 0,0-1 0 0 0,0 1 0 0 0,0 0 1 0 0,-1 0-1 0 0,1-1 0 0 0,0 1 0 0 0,0-1 0 0 0,0 1 0 0 0,0-1 0 0 0,-1 1 0 0 0,1-1 1 0 0,0 1-1 0 0,0-1 0 0 0,0 0 0 0 0,0 0 0 0 0,1 0 0 0 0,-1 0 0 0 0,0 1 1 0 0,0-1-1 0 0,0 0 0 0 0,1 0 0 0 0,-1-1 0 0 0,0 1 0 0 0,1 0 0 0 0,-1 0 1 0 0,1 0-1 0 0,0 0 0 0 0,-1 0 0 0 0,1-1 0 0 0,0 1 0 0 0,-1 0 0 0 0,1 0 1 0 0,0 0-1 0 0,0-1 0 0 0,0 1 0 0 0,0 0 0 0 0,0 0 0 0 0,1-1 0 0 0,-1 1 1 0 0,0 0-1 0 0,1 0 0 0 0,-1 0 0 0 0,0-1 0 0 0,1 1 0 0 0,-1 0 0 0 0,1 0 1 0 0,0 0-1 0 0,1-2 0 0 0,-1 2 7 0 0,1 0 0 0 0,0-1 0 0 0,0 1 1 0 0,0 0-1 0 0,-1 1 0 0 0,1-1 0 0 0,0 0 0 0 0,0 0 1 0 0,0 1-1 0 0,0-1 0 0 0,0 1 0 0 0,0 0 0 0 0,0 0 1 0 0,0 0-1 0 0,1-1 0 0 0,-1 2 0 0 0,0-1 0 0 0,0 0 1 0 0,0 0-1 0 0,0 1 0 0 0,0-1 0 0 0,2 2 0 0 0,7 2 127 0 0,0 0 0 0 0,20 12-1 0 0,0-1 125 0 0,-13-8-164 0 0,1-1-1 0 0,24 6 1 0 0,-33-10-121 0 0</inkml:trace>
+  <inkml:trace contextRef="#ctx0" brushRef="#br0" timeOffset="677.64">436 91 7232 0 0,'0'0'190'0'0,"-5"-25"572"0"0,8 22-670 0 0,-1-1 0 0 0,1 1 0 0 0,1 0 1 0 0,-1 0-1 0 0,0 0 0 0 0,1 0 0 0 0,0 0 0 0 0,-1 1 1 0 0,1-1-1 0 0,0 1 0 0 0,0 0 0 0 0,1 0 0 0 0,-1 1 1 0 0,0-1-1 0 0,1 1 0 0 0,-1 0 0 0 0,0 0 1 0 0,1 1-1 0 0,-1-1 0 0 0,1 1 0 0 0,8 0 0 0 0,-10 0-65 0 0,1 0 0 0 0,-1 0 0 0 0,0 1 0 0 0,0-1 0 0 0,0 1 0 0 0,0-1 0 0 0,0 1-1 0 0,0 0 1 0 0,0 0 0 0 0,-1 0 0 0 0,1 0 0 0 0,0 1 0 0 0,0-1 0 0 0,-1 1 0 0 0,1 0-1 0 0,-1 0 1 0 0,1 0 0 0 0,-1 0 0 0 0,0 0 0 0 0,0 0 0 0 0,0 0 0 0 0,0 1 0 0 0,0-1 0 0 0,0 1-1 0 0,-1 0 1 0 0,0-1 0 0 0,1 1 0 0 0,-1 0 0 0 0,0 0 0 0 0,0 0 0 0 0,0 0 0 0 0,-1 0-1 0 0,1 3 1 0 0,-1 3 71 0 0,-1 1-1 0 0,-1-1 1 0 0,0 1 0 0 0,-1-1-1 0 0,1 0 1 0 0,-2 0-1 0 0,1 0 1 0 0,-1 0-1 0 0,-1-1 1 0 0,1 1-1 0 0,-12 14 1 0 0,9-15 47 0 0,-1 0-1 0 0,1-1 1 0 0,-1 1-1 0 0,-1-2 1 0 0,1 1 0 0 0,-17 8-1 0 0,22-13-77 0 0,0 0-1 0 0,0-1 0 0 0,-1 0 0 0 0,1 1 0 0 0,0-1 1 0 0,-1 0-1 0 0,1-1 0 0 0,-1 1 0 0 0,0-1 0 0 0,1 1 1 0 0,-1-1-1 0 0,1 0 0 0 0,-1-1 0 0 0,0 1 0 0 0,1 0 1 0 0,-1-1-1 0 0,1 0 0 0 0,-1 0 0 0 0,1 0 0 0 0,0 0 1 0 0,-1-1-1 0 0,1 1 0 0 0,-4-3 0 0 0,7 4-44 0 0,-1 0 1 0 0,1-1-1 0 0,-1 1 0 0 0,0 0 0 0 0,1 0 0 0 0,-1-1 0 0 0,1 1 1 0 0,-1 0-1 0 0,1 0 0 0 0,-1-1 0 0 0,1 1 0 0 0,0-1 0 0 0,-1 1 1 0 0,1-1-1 0 0,-1 1 0 0 0,1 0 0 0 0,0-1 0 0 0,-1 1 0 0 0,1-1 1 0 0,0 0-1 0 0,0 1 0 0 0,-1-1 0 0 0,1 1 0 0 0,0-1 0 0 0,0 1 1 0 0,0-1-1 0 0,0 0 0 0 0,0 1 0 0 0,0-1 0 0 0,0 1 1 0 0,0-1-1 0 0,0 1 0 0 0,0-1 0 0 0,0 0 0 0 0,0 1 0 0 0,0-1 1 0 0,0 1-1 0 0,0-1 0 0 0,1 0 0 0 0,-1 1 0 0 0,0-1 0 0 0,0 1 1 0 0,1-1-1 0 0,-1 1 0 0 0,0-1 0 0 0,1 1 0 0 0,0-1 0 0 0,0 0 26 0 0,0 0 0 0 0,1 0 0 0 0,-1 0 0 0 0,0 1-1 0 0,1-1 1 0 0,-1 1 0 0 0,0-1 0 0 0,1 1-1 0 0,-1-1 1 0 0,1 1 0 0 0,-1 0 0 0 0,1 0 0 0 0,-1-1-1 0 0,1 1 1 0 0,-1 0 0 0 0,1 1 0 0 0,-1-1-1 0 0,3 0 1 0 0,4 3-24 0 0,-1 0-1 0 0,1 1 1 0 0,-1-1-1 0 0,1 2 1 0 0,11 8-1 0 0,-15-10-11 0 0,1 1-1 0 0,-1-1 1 0 0,0 0-1 0 0,1-1 1 0 0,0 1-1 0 0,0-1 1 0 0,-1 0 0 0 0,1 0-1 0 0,1 0 1 0 0,-1 0-1 0 0,0-1 1 0 0,0 0-1 0 0,0 0 1 0 0,1-1-1 0 0,-1 0 1 0 0,7 0-1 0 0,-5-1-11 0 0</inkml:trace>
+  <inkml:trace contextRef="#ctx0" brushRef="#br0" timeOffset="828.77">697 249 9344 0 0,'0'0'480'0'0,"0"9"-232"0"0,0-7 0 0 0,0-2-144 0 0,0 1 16 0 0,0 0 104 0 0,0 0-8 0 0,0 0 0 0 0</inkml:trace>
+  <inkml:trace contextRef="#ctx0" brushRef="#br0" timeOffset="1368.03">913 59 6632 0 0,'-32'4'286'0'0,"28"-2"-237"0"0,-1 0 0 0 0,1 0-1 0 0,0 1 1 0 0,0-1 0 0 0,0 1-1 0 0,0 0 1 0 0,0 1 0 0 0,0-1-1 0 0,1 0 1 0 0,0 1 0 0 0,0 0-1 0 0,0 0 1 0 0,0 0 0 0 0,0 0-1 0 0,1 0 1 0 0,-3 8 0 0 0,2-6 2 0 0,1 1 1 0 0,0 0-1 0 0,0 1 1 0 0,1-1 0 0 0,0 0-1 0 0,0 0 1 0 0,1 1-1 0 0,0-1 1 0 0,0 0-1 0 0,2 12 1 0 0,-1-17-38 0 0,-1 1-1 0 0,1 0 1 0 0,-1 0-1 0 0,1-1 1 0 0,0 1-1 0 0,1 0 1 0 0,-1-1 0 0 0,0 1-1 0 0,1-1 1 0 0,-1 1-1 0 0,1-1 1 0 0,0 0-1 0 0,-1 0 1 0 0,1 0 0 0 0,0 0-1 0 0,1 0 1 0 0,2 2-1 0 0,-1-1 20 0 0,0-1-1 0 0,0 0 1 0 0,1 0-1 0 0,-1 0 1 0 0,1-1-1 0 0,-1 0 1 0 0,1 0-1 0 0,-1 0 1 0 0,9 1-1 0 0,-1-2 104 0 0,1 0 0 0 0,0 0 0 0 0,-1-2 0 0 0,1 1-1 0 0,-1-2 1 0 0,23-6 0 0 0,-31 8-61 0 0,-1-1-1 0 0,0 1 1 0 0,1-1 0 0 0,-1 0-1 0 0,0 0 1 0 0,0 0 0 0 0,0 0-1 0 0,0 0 1 0 0,-1-1 0 0 0,1 1-1 0 0,0-1 1 0 0,-1 0 0 0 0,0 0-1 0 0,0 0 1 0 0,4-6-1 0 0,-4 3 8 0 0,1 1 0 0 0,-1-1 0 0 0,-1 1 0 0 0,1-1 0 0 0,-1 0 0 0 0,0 0 0 0 0,0 0 0 0 0,-1 0 0 0 0,1-8-1 0 0,-2 6 36 0 0,1 0 0 0 0,-1 0 0 0 0,0 0 0 0 0,-1 0 0 0 0,0 0 0 0 0,0 0 0 0 0,-1 1-1 0 0,0-1 1 0 0,0 1 0 0 0,-1-1 0 0 0,0 1 0 0 0,0 0 0 0 0,0 1 0 0 0,-10-11 0 0 0,12 15-78 0 0,1 0 1 0 0,-1 1 0 0 0,0-1 0 0 0,0 0 0 0 0,0 1-1 0 0,0 0 1 0 0,0 0 0 0 0,-1 0 0 0 0,1-1 0 0 0,0 2-1 0 0,0-1 1 0 0,-1 0 0 0 0,1 0 0 0 0,-1 1 0 0 0,1 0-1 0 0,0-1 1 0 0,-1 1 0 0 0,1 0 0 0 0,-1 0 0 0 0,1 0-1 0 0,-1 0 1 0 0,1 1 0 0 0,-1-1 0 0 0,1 1-1 0 0,0-1 1 0 0,-1 1 0 0 0,1 0 0 0 0,0 0 0 0 0,0 0-1 0 0,-4 2 1 0 0,-3 4 139 0 0,0 0 0 0 0,0 0 0 0 0,1 0 0 0 0,0 1 0 0 0,-9 12 0 0 0,16-19-173 0 0,-1 1 30 0 0,0 1 0 0 0,0-1 1 0 0,1 1-1 0 0,-1 0 0 0 0,1 0 1 0 0,-1 0-1 0 0,1-1 0 0 0,0 1 0 0 0,0 0 1 0 0,0 0-1 0 0,0 1 0 0 0,1-1 1 0 0,-1 0-1 0 0,1 0 0 0 0,0 6 1 0 0,0-8-27 0 0,0 1 1 0 0,1 0 0 0 0,-1 0 0 0 0,0-1 0 0 0,1 1 0 0 0,0 0 0 0 0,-1-1-1 0 0,1 1 1 0 0,0-1 0 0 0,0 1 0 0 0,0-1 0 0 0,0 1 0 0 0,0-1 0 0 0,0 0-1 0 0,0 1 1 0 0,1-1 0 0 0,-1 0 0 0 0,0 0 0 0 0,1 0 0 0 0,-1 0 0 0 0,1 0-1 0 0,-1 0 1 0 0,1 0 0 0 0,-1 0 0 0 0,1-1 0 0 0,0 1 0 0 0,-1-1 0 0 0,1 1-1 0 0,0-1 1 0 0,1 1 0 0 0,9 1 30 0 0</inkml:trace>
+  <inkml:trace contextRef="#ctx0" brushRef="#br0" timeOffset="1682.45">1182 35 11808 0 0,'-4'5'2'0'0,"0"1"0"0"0,1-1 0 0 0,-1 1 0 0 0,1 0 0 0 0,1 0 0 0 0,0 1 0 0 0,-1-1 0 0 0,2 0 0 0 0,-1 1 0 0 0,-1 12 0 0 0,3-17 11 0 0,0 0 0 0 0,0 0-1 0 0,0 1 1 0 0,0-1 0 0 0,0 0 0 0 0,0 0-1 0 0,0 0 1 0 0,1 0 0 0 0,-1 0-1 0 0,1 0 1 0 0,-1 0 0 0 0,1 0-1 0 0,0 0 1 0 0,0 0 0 0 0,0 0 0 0 0,0 0-1 0 0,0 0 1 0 0,1-1 0 0 0,-1 1-1 0 0,0-1 1 0 0,1 1 0 0 0,-1-1-1 0 0,1 1 1 0 0,0-1 0 0 0,-1 0 0 0 0,1 1-1 0 0,0-1 1 0 0,0 0 0 0 0,0 0-1 0 0,0 0 1 0 0,0-1 0 0 0,0 1-1 0 0,0 0 1 0 0,0-1 0 0 0,0 1 0 0 0,0-1-1 0 0,3 0 1 0 0,22 5 138 0 0,-19-4-92 0 0,-1 1-1 0 0,0-1 1 0 0,0 0 0 0 0,0-1 0 0 0,1 0 0 0 0,-1 0-1 0 0,0 0 1 0 0,12-3 0 0 0,-12 0 4 0 0</inkml:trace>
+  <inkml:trace contextRef="#ctx0" brushRef="#br0" timeOffset="1954.53">1328 60 6328 0 0,'-20'110'1982'0'0,"14"-85"-1807"0"0,4-18 18 0 0,0 0 0 0 0,1 0 0 0 0,0 0 0 0 0,0 0 0 0 0,0 0 0 0 0,1 0 0 0 0,0 0 0 0 0,2 13 0 0 0,12 0 218 0 0,-10-17-364 0 0</inkml:trace>
+  <inkml:trace contextRef="#ctx0" brushRef="#br0" timeOffset="2148.35">1435 253 5824 0 0,'0'0'2760'0'0</inkml:trace>
+  <inkml:trace contextRef="#ctx0" brushRef="#br0" timeOffset="2955.64">1618 39 5920 0 0,'24'-25'910'0'0,"-20"23"-831"0"0,0 0 0 0 0,0 0 0 0 0,0 0 0 0 0,0 1 0 0 0,0 0 0 0 0,1 0 0 0 0,-1 0 0 0 0,1 0 0 0 0,-1 1 0 0 0,0 0 0 0 0,1 0 0 0 0,-1 0 0 0 0,1 0 0 0 0,-1 1 0 0 0,1-1 0 0 0,-1 1 0 0 0,0 1 0 0 0,1-1 0 0 0,-1 0 0 0 0,0 1 0 0 0,0 0 0 0 0,5 3 0 0 0,-2-2 1 0 0,-1 1-1 0 0,1 0 1 0 0,-1 0-1 0 0,0 1 1 0 0,0 0-1 0 0,0 0 1 0 0,-1 0-1 0 0,0 1 1 0 0,0 0-1 0 0,0 0 1 0 0,-1 0 0 0 0,6 10-1 0 0,-9-12-41 0 0,0-1-1 0 0,0 1 1 0 0,-1-1 0 0 0,1 1 0 0 0,-1 0-1 0 0,0-1 1 0 0,0 1 0 0 0,0-1-1 0 0,0 1 1 0 0,-1 0 0 0 0,0-1 0 0 0,0 1-1 0 0,1-1 1 0 0,-2 0 0 0 0,1 1 0 0 0,0-1-1 0 0,-1 0 1 0 0,0 0 0 0 0,-3 6-1 0 0,0-2 19 0 0,0 0-1 0 0,0 0 1 0 0,0 0 0 0 0,-1-1-1 0 0,0 0 1 0 0,0 0-1 0 0,-10 7 1 0 0,7-8-17 0 0,0 1 1 0 0,-1-1-1 0 0,0-1 1 0 0,0 0-1 0 0,-1 0 1 0 0,-11 2-1 0 0,17-4 36 0 0,-1-1 0 0 0,0 0 0 0 0,0 0 0 0 0,1-1 0 0 0,-1 0 0 0 0,0 0 0 0 0,0 0 0 0 0,1-1 0 0 0,-1 1 0 0 0,0-1 0 0 0,1-1 0 0 0,-1 1 0 0 0,-7-4 0 0 0,13 5-72 0 0,-1 0 0 0 0,1 0 0 0 0,-1 0 0 0 0,1-1 0 0 0,-1 1-1 0 0,1 0 1 0 0,-1 0 0 0 0,1-1 0 0 0,-1 1 0 0 0,1 0 0 0 0,-1-1-1 0 0,1 1 1 0 0,0 0 0 0 0,-1-1 0 0 0,1 1 0 0 0,0-1 0 0 0,-1 1 0 0 0,1 0-1 0 0,0-1 1 0 0,-1 1 0 0 0,1-1 0 0 0,0 1 0 0 0,0-1 0 0 0,0 1-1 0 0,-1-1 1 0 0,1 0 0 0 0,0 0 5 0 0,1 1 0 0 0,-1-1 0 0 0,1 1 0 0 0,-1-1 1 0 0,0 1-1 0 0,1-1 0 0 0,-1 1 0 0 0,1 0 0 0 0,-1-1 0 0 0,1 1 0 0 0,-1 0 0 0 0,1-1 0 0 0,-1 1 0 0 0,1 0 0 0 0,0 0 0 0 0,-1-1 0 0 0,1 1 1 0 0,0 0-1 0 0,31-5 417 0 0,-23 6-275 0 0,0 0 0 0 0,0 1 0 0 0,0 1-1 0 0,0-1 1 0 0,-1 2 0 0 0,1-1 0 0 0,-1 1 0 0 0,0 0-1 0 0,11 8 1 0 0,14 6 395 0 0,6-2-59 0 0,-36-14-473 0 0,1-1 0 0 0,-1 0 0 0 0,1 0-1 0 0,-1 0 1 0 0,1-1 0 0 0,-1 1 0 0 0,1-1 0 0 0,0 0 0 0 0,5 0 0 0 0,-4-3-5 0 0</inkml:trace>
+  <inkml:trace contextRef="#ctx0" brushRef="#br0" timeOffset="3512.58">1931 65 8136 0 0,'-17'16'583'0'0,"15"-14"-524"0"0,0 0-1 0 0,-1 0 0 0 0,2 0 0 0 0,-1 0 1 0 0,0 0-1 0 0,0 0 0 0 0,1 0 0 0 0,-1 1 0 0 0,1-1 1 0 0,-1 0-1 0 0,1 1 0 0 0,0 0 0 0 0,0-1 0 0 0,0 1 1 0 0,0-1-1 0 0,0 7 0 0 0,-1 4 276 0 0,1 0-1 0 0,0 0 1 0 0,2 23-1 0 0,0-32-266 0 0,-1 0 0 0 0,1-1 0 0 0,0 1 0 0 0,0-1 0 0 0,0 1 0 0 0,0-1 0 0 0,1 1 0 0 0,-1-1 0 0 0,1 0 0 0 0,0 1 0 0 0,0-1 0 0 0,0 0 0 0 0,1 0 0 0 0,-1 0 0 0 0,1-1 0 0 0,-1 1 0 0 0,6 3 0 0 0,-2-2 27 0 0,1 0-1 0 0,0 0 1 0 0,0-1-1 0 0,0 0 1 0 0,0-1-1 0 0,0 1 1 0 0,1-1-1 0 0,-1-1 1 0 0,0 1 0 0 0,1-1-1 0 0,0-1 1 0 0,-1 1-1 0 0,14-2 1 0 0,-17 1-51 0 0,0-1 0 0 0,0 1 0 0 0,-1-1 0 0 0,1 0 0 0 0,0 0 0 0 0,-1 0 0 0 0,1-1 0 0 0,-1 1 0 0 0,1-1 0 0 0,-1 0 0 0 0,0 0 0 0 0,0 0 0 0 0,1 0 0 0 0,-1 0 0 0 0,-1-1 0 0 0,1 1 0 0 0,0-1 0 0 0,-1 0 0 0 0,1 0 0 0 0,-1 0 0 0 0,0 0 0 0 0,0 0 0 0 0,0-1 0 0 0,0 1 0 0 0,-1-1 0 0 0,0 1 0 0 0,1-1 0 0 0,-1 1 0 0 0,1-7 0 0 0,0-3 67 0 0,-1 0 0 0 0,0 0 0 0 0,-1-15 0 0 0,0 24-35 0 0,0 0 0 0 0,-1 1 0 0 0,1-1 1 0 0,-1 0-1 0 0,1 1 0 0 0,-1-1 0 0 0,0 1 0 0 0,-1-1 1 0 0,1 1-1 0 0,-1 0 0 0 0,1-1 0 0 0,-1 1 1 0 0,0 0-1 0 0,0 0 0 0 0,-1 0 0 0 0,-3-4 1 0 0,4 6 6 0 0,0 0 0 0 0,-1-1 0 0 0,1 1 0 0 0,-1 0 1 0 0,1 0-1 0 0,-1 0 0 0 0,1 1 0 0 0,-1-1 1 0 0,0 1-1 0 0,1-1 0 0 0,-1 1 0 0 0,0 0 1 0 0,1 0-1 0 0,-1 0 0 0 0,0 0 0 0 0,0 0 1 0 0,1 1-1 0 0,-1 0 0 0 0,0-1 0 0 0,1 1 1 0 0,-1 0-1 0 0,-4 2 0 0 0,-5 3 152 0 0,-1 1 0 0 0,1 0 1 0 0,-13 10-1 0 0,15-10 85 0 0,8-6-297 0 0,1 0 0 0 0,0-1-1 0 0,0 1 1 0 0,-1 0-1 0 0,1 0 1 0 0,0 0 0 0 0,0 0-1 0 0,0 0 1 0 0,0 0-1 0 0,0 1 1 0 0,1-1 0 0 0,-1 0-1 0 0,0 0 1 0 0,0 1-1 0 0,1-1 1 0 0,-1 0 0 0 0,1 1-1 0 0,-1-1 1 0 0,1 0-1 0 0,0 1 1 0 0,-1-1 0 0 0,1 1-1 0 0,0-1 1 0 0,0 1-1 0 0,0-1 1 0 0,0 1 0 0 0,0-1-1 0 0,0 1 1 0 0,1-1-1 0 0,-1 0 1 0 0,1 3 0 0 0,1-1-6 0 0,-1 0 0 0 0,1 0 0 0 0,0 0 0 0 0,0-1 0 0 0,0 1 1 0 0,0-1-1 0 0,0 0 0 0 0,0 1 0 0 0,1-1 0 0 0,-1 0 0 0 0,1 0 0 0 0,-1-1 1 0 0,6 4-1 0 0,7 2-2 0 0</inkml:trace>
+  <inkml:trace contextRef="#ctx0" brushRef="#br0" timeOffset="4154.26">2251 133 4216 0 0,'-14'-23'601'0'0,"14"22"-557"0"0,-1-1 0 0 0,1 0 0 0 0,0 0 0 0 0,-1 1 0 0 0,1-1 1 0 0,0 0-1 0 0,0 1 0 0 0,0-1 0 0 0,0 0 0 0 0,1 0 0 0 0,-1 1 0 0 0,0-1 0 0 0,1 0 0 0 0,-1 1 0 0 0,1-1 0 0 0,0 0 0 0 0,-1 1 0 0 0,1-1 0 0 0,0 1 0 0 0,0-1 0 0 0,0 1 0 0 0,0-1 1 0 0,0 1-1 0 0,0 0 0 0 0,2-2 0 0 0,1 0-3 0 0,0 1 1 0 0,0 0-1 0 0,0 0 1 0 0,0 0-1 0 0,1 0 0 0 0,-1 0 1 0 0,0 1-1 0 0,9-1 1 0 0,-6 1-14 0 0,0 0-1 0 0,1 1 1 0 0,-1 0 0 0 0,1 0 0 0 0,-1 1-1 0 0,0 0 1 0 0,1 0 0 0 0,-1 1 0 0 0,0 0-1 0 0,0 0 1 0 0,0 1 0 0 0,8 4 0 0 0,-12-6 10 0 0,1 1 0 0 0,0-1 0 0 0,-1 1 0 0 0,0 0 1 0 0,1 1-1 0 0,-1-1 0 0 0,0 0 0 0 0,0 1 0 0 0,0 0 0 0 0,-1 0 0 0 0,1 0 1 0 0,-1 0-1 0 0,1 0 0 0 0,-1 0 0 0 0,0 1 0 0 0,0-1 0 0 0,0 1 0 0 0,-1-1 1 0 0,1 1-1 0 0,-1 0 0 0 0,0 0 0 0 0,0-1 0 0 0,0 1 0 0 0,0 6 0 0 0,-2-5 36 0 0,0 0 0 0 0,0 0-1 0 0,0 0 1 0 0,-1-1-1 0 0,0 1 1 0 0,0 0 0 0 0,0-1-1 0 0,0 1 1 0 0,-1-1-1 0 0,0 1 1 0 0,1-1-1 0 0,-2 0 1 0 0,1 0 0 0 0,0-1-1 0 0,-1 1 1 0 0,0-1-1 0 0,0 1 1 0 0,0-1 0 0 0,0 0-1 0 0,-8 3 1 0 0,5-1 155 0 0,0-1 1 0 0,-1 0 0 0 0,0-1-1 0 0,0 0 1 0 0,0 0 0 0 0,0-1-1 0 0,0 0 1 0 0,0-1 0 0 0,-1 1-1 0 0,1-1 1 0 0,-16-1 0 0 0,23 0-167 0 0,0 0-1 0 0,0 0 1 0 0,0 0 0 0 0,0 0 0 0 0,0 0 0 0 0,0-1 0 0 0,0 1 0 0 0,0 0-1 0 0,0-1 1 0 0,0 1 0 0 0,0-1 0 0 0,0 1 0 0 0,0-1 0 0 0,0 1 0 0 0,1-1 0 0 0,-1 0-1 0 0,0 1 1 0 0,0-1 0 0 0,1 0 0 0 0,-1 0 0 0 0,0 1 0 0 0,1-1 0 0 0,-1 0-1 0 0,0 0 1 0 0,1 0 0 0 0,-1 0 0 0 0,1 0 0 0 0,0 0 0 0 0,-1 0 0 0 0,1 0 0 0 0,0 0-1 0 0,0 0 1 0 0,-1-2 0 0 0,1 2-4 0 0,0 0 0 0 0,1-1 0 0 0,-1 1 0 0 0,0 0 0 0 0,1-1 0 0 0,-1 1-1 0 0,0 0 1 0 0,1 0 0 0 0,-1-1 0 0 0,1 1 0 0 0,0 0 0 0 0,-1 0 0 0 0,1 0 0 0 0,0 0 0 0 0,0 0 0 0 0,0 0 0 0 0,0 0-1 0 0,0 0 1 0 0,0 0 0 0 0,0 1 0 0 0,0-1 0 0 0,0 0 0 0 0,0 0 0 0 0,0 1 0 0 0,0-1 0 0 0,2 0 0 0 0,-1 1 10 0 0,0-1 0 0 0,-1 1 0 0 0,1 0 1 0 0,0 0-1 0 0,-1 0 0 0 0,1 0 1 0 0,0 0-1 0 0,0 0 0 0 0,-1 0 1 0 0,1 0-1 0 0,0 1 0 0 0,-1-1 0 0 0,1 1 1 0 0,0-1-1 0 0,2 2 0 0 0,25 16 537 0 0,1-1-315 0 0,4-6 196 0 0,68 14 0 0 0,-86-26-433 0 0,-10-1-24 0 0</inkml:trace>
+  <inkml:trace contextRef="#ctx0" brushRef="#br0" timeOffset="4596.4">2670 42 8432 0 0,'-19'12'782'0'0,"13"-8"-603"0"0,1 0-1 0 0,0 1 1 0 0,0 0-1 0 0,0 0 1 0 0,1 0-1 0 0,-1 1 1 0 0,1-1-1 0 0,1 1 1 0 0,-1 0-1 0 0,-5 12 1 0 0,2 0 287 0 0,1 0 0 0 0,-8 32 0 0 0,13-47-396 0 0,0 0 0 0 0,0 0 0 0 0,1 0 1 0 0,0 0-1 0 0,-1 0 0 0 0,1 0 0 0 0,0 0 0 0 0,0 0 1 0 0,1 0-1 0 0,-1 0 0 0 0,1 0 0 0 0,-1-1 1 0 0,1 1-1 0 0,0 0 0 0 0,0 0 0 0 0,0 0 0 0 0,1 0 1 0 0,-1-1-1 0 0,1 1 0 0 0,-1-1 0 0 0,5 5 1 0 0,-3-4-3 0 0,0 0 1 0 0,1-1-1 0 0,0 1 1 0 0,0-1 0 0 0,0 0-1 0 0,0 0 1 0 0,0 0 0 0 0,0-1-1 0 0,0 0 1 0 0,1 1 0 0 0,-1-1-1 0 0,0-1 1 0 0,1 1 0 0 0,4 0-1 0 0,-1-1 11 0 0,-1 0 1 0 0,0 0-1 0 0,0-1 0 0 0,1 0 0 0 0,-1 0 0 0 0,0-1 1 0 0,7-2-1 0 0,-12 3-47 0 0,0 0 0 0 0,-1 1 0 0 0,1-1 0 0 0,-1 0 0 0 0,1 0 0 0 0,-1 0 0 0 0,1 0 0 0 0,-1 0 0 0 0,0 0 0 0 0,1 0 0 0 0,-1 0 0 0 0,0-1 0 0 0,0 1 0 0 0,0 0 0 0 0,1-3 0 0 0,-1 3 12 0 0,-1 0 0 0 0,0 0-1 0 0,0-1 1 0 0,1 1 0 0 0,-1 0-1 0 0,0 0 1 0 0,0-1-1 0 0,0 1 1 0 0,0 0 0 0 0,-1-1-1 0 0,1 1 1 0 0,0 0 0 0 0,0-1-1 0 0,-1 1 1 0 0,1 0-1 0 0,-1 0 1 0 0,1 0 0 0 0,-1-1-1 0 0,0 1 1 0 0,1 0 0 0 0,-1 0-1 0 0,0 0 1 0 0,-1-1-1 0 0,-1-1-6 0 0,0 0-1 0 0,1 0 0 0 0,-1 1 0 0 0,-1 0 0 0 0,1-1 0 0 0,0 1 0 0 0,0 0 0 0 0,-1 0 0 0 0,1 1 0 0 0,-1-1 0 0 0,0 1 0 0 0,0 0 0 0 0,1 0 0 0 0,-1 0 0 0 0,0 0 0 0 0,0 1 0 0 0,0-1 0 0 0,0 1 0 0 0,0 0 0 0 0,0 1 0 0 0,1-1 0 0 0,-1 0 0 0 0,0 1 0 0 0,0 0 0 0 0,0 0 0 0 0,0 0 0 0 0,1 1 0 0 0,-1-1 0 0 0,1 1 0 0 0,-1 0 1 0 0,1-1-1 0 0,-1 2 0 0 0,1-1 0 0 0,0 0 0 0 0,0 1 0 0 0,-5 4 0 0 0,3-1-18 0 0,0-3-2 0 0</inkml:trace>
+</inkml:ink>
 </file>
 
 <file path=word/theme/theme1.xml><?xml version="1.0" encoding="utf-8"?>

</xml_diff>